<commit_message>
last changes to inform
</commit_message>
<xml_diff>
--- a/docs/Informe_Actividad_1_GeneraciondeCodigo.docx
+++ b/docs/Informe_Actividad_1_GeneraciondeCodigo.docx
@@ -34,11 +34,81 @@
         <w:t>Desarrollo de aplicaciones con asistentes de programación basados en IA</w:t>
       </w:r>
     </w:p>
-    <w:p/>
+    <w:p>
+      <w:pPr>
+        <w:jc w:val="left"/>
+      </w:pPr>
+      <w:r>
+        <w:br/>
+      </w:r>
+      <w:r>
+        <w:rPr>
+          <w:b/>
+          <w:bCs/>
+        </w:rPr>
+        <w:t>APLICACIÓN EN PRD</w:t>
+      </w:r>
+      <w:r>
+        <w:t xml:space="preserve">: </w:t>
+      </w:r>
+      <w:hyperlink r:id="rId11" w:history="1">
+        <w:r>
+          <w:rPr>
+            <w:rStyle w:val="Hyperlink"/>
+          </w:rPr>
+          <w:t>https://latamtradex-actividad1.azucarsintactica.com/login</w:t>
+        </w:r>
+      </w:hyperlink>
+      <w:r>
+        <w:br/>
+      </w:r>
+      <w:r>
+        <w:rPr>
+          <w:b/>
+          <w:bCs/>
+        </w:rPr>
+        <w:t>CODIGO FUENTE</w:t>
+      </w:r>
+      <w:r>
+        <w:t xml:space="preserve"> : </w:t>
+      </w:r>
+      <w:hyperlink r:id="rId12" w:history="1">
+        <w:r>
+          <w:rPr>
+            <w:rStyle w:val="Hyperlink"/>
+          </w:rPr>
+          <w:t>https://github.com/juank704/latamtradex-generativecode</w:t>
+        </w:r>
+      </w:hyperlink>
+      <w:r>
+        <w:br/>
+      </w:r>
+      <w:r>
+        <w:rPr>
+          <w:b/>
+          <w:bCs/>
+        </w:rPr>
+        <w:t>INSTRUCCIONES</w:t>
+      </w:r>
+      <w:r>
+        <w:t xml:space="preserve">: </w:t>
+      </w:r>
+      <w:hyperlink r:id="rId13" w:history="1">
+        <w:r>
+          <w:rPr>
+            <w:rStyle w:val="Hyperlink"/>
+          </w:rPr>
+          <w:t>https://github.com/juank704/latamtradex-generativecode/tree/main#-credenciales-de-acceso-demo</w:t>
+        </w:r>
+      </w:hyperlink>
+    </w:p>
     <w:p>
       <w:pPr>
         <w:pStyle w:val="TtuloApartado2"/>
       </w:pPr>
+      <w:r>
+        <w:br/>
+      </w:r>
       <w:r>
         <w:t>Descripción del Proyecto</w:t>
       </w:r>
@@ -85,26 +155,20 @@
         <w:rPr>
           <w:rStyle w:val="Heading4Char"/>
         </w:rPr>
-        <w:t>Arquitectura y Stack Tecnológico</w:t>
-      </w:r>
-      <w:r>
-        <w:rPr>
-          <w:rStyle w:val="Heading4Char"/>
-        </w:rPr>
-        <w:t>:</w:t>
-      </w:r>
-    </w:p>
-    <w:p>
-      <w:pPr>
-        <w:rPr>
-          <w:lang w:val="en-US"/>
-        </w:rPr>
-      </w:pPr>
-      <w:r>
-        <w:rPr>
-          <w:lang w:val="en-US"/>
-        </w:rPr>
-        <w:t>Framework Principal: Next.js (React + Node.js)</w:t>
+        <w:t>Arquitectura y Stack Tecnológico:</w:t>
+      </w:r>
+    </w:p>
+    <w:p>
+      <w:r>
+        <w:t>Framework Principal: Next.js (</w:t>
+      </w:r>
+      <w:proofErr w:type="spellStart"/>
+      <w:r>
+        <w:t>React</w:t>
+      </w:r>
+      <w:proofErr w:type="spellEnd"/>
+      <w:r>
+        <w:t xml:space="preserve"> + Node.js)</w:t>
       </w:r>
     </w:p>
     <w:p>
@@ -134,6 +198,7 @@
     </w:p>
     <w:p>
       <w:r>
+        <w:lastRenderedPageBreak/>
         <w:t xml:space="preserve">Despliegue y Automatización: Contenedores con Docker y Docker </w:t>
       </w:r>
       <w:proofErr w:type="spellStart"/>
@@ -144,18 +209,13 @@
       <w:r>
         <w:t xml:space="preserve"> para garantizar un entorno de desarrollo reproducible y facilitar el despliegue.</w:t>
       </w:r>
-      <w:r>
-        <w:br/>
-      </w:r>
     </w:p>
     <w:p/>
-    <w:p/>
     <w:p>
       <w:pPr>
         <w:pStyle w:val="TtuloApartado2"/>
       </w:pPr>
       <w:r>
-        <w:lastRenderedPageBreak/>
         <w:t>Requisitos Iniciales</w:t>
       </w:r>
     </w:p>
@@ -293,21 +353,7 @@
         <w:pStyle w:val="TtuloApartado2"/>
       </w:pPr>
     </w:p>
-    <w:p>
-      <w:pPr>
-        <w:pStyle w:val="TtuloApartado2"/>
-      </w:pPr>
-    </w:p>
-    <w:p>
-      <w:pPr>
-        <w:pStyle w:val="TtuloApartado2"/>
-      </w:pPr>
-    </w:p>
-    <w:p>
-      <w:pPr>
-        <w:pStyle w:val="TtuloApartado2"/>
-      </w:pPr>
-    </w:p>
+    <w:p/>
     <w:p>
       <w:pPr>
         <w:pStyle w:val="TtuloApartado2"/>
@@ -355,7 +401,7 @@
                     </pic:cNvPicPr>
                   </pic:nvPicPr>
                   <pic:blipFill>
-                    <a:blip r:embed="rId11" cstate="print">
+                    <a:blip r:embed="rId14" cstate="print">
                       <a:extLst>
                         <a:ext uri="{28A0092B-C50C-407E-A947-70E740481C1C}">
                           <a14:useLocalDpi xmlns:a14="http://schemas.microsoft.com/office/drawing/2010/main" val="0"/>
@@ -423,7 +469,7 @@
                     </pic:cNvPicPr>
                   </pic:nvPicPr>
                   <pic:blipFill>
-                    <a:blip r:embed="rId12" cstate="print">
+                    <a:blip r:embed="rId15" cstate="print">
                       <a:extLst>
                         <a:ext uri="{28A0092B-C50C-407E-A947-70E740481C1C}">
                           <a14:useLocalDpi xmlns:a14="http://schemas.microsoft.com/office/drawing/2010/main" val="0"/>
@@ -478,6 +524,9 @@
         <w:br/>
       </w:r>
       <w:r>
+        <w:rPr>
+          <w:noProof/>
+        </w:rPr>
         <w:drawing>
           <wp:inline distT="0" distB="0" distL="0" distR="0" wp14:anchorId="19B96195" wp14:editId="5E9EAFAC">
             <wp:extent cx="5219700" cy="4530725"/>
@@ -494,7 +543,7 @@
                     <pic:cNvPicPr/>
                   </pic:nvPicPr>
                   <pic:blipFill>
-                    <a:blip r:embed="rId13"/>
+                    <a:blip r:embed="rId16"/>
                     <a:stretch>
                       <a:fillRect/>
                     </a:stretch>
@@ -540,6 +589,9 @@
         <w:br/>
       </w:r>
       <w:r>
+        <w:rPr>
+          <w:noProof/>
+        </w:rPr>
         <w:drawing>
           <wp:inline distT="0" distB="0" distL="0" distR="0" wp14:anchorId="624C85A0" wp14:editId="1F0EDEFC">
             <wp:extent cx="5219700" cy="4447540"/>
@@ -556,7 +608,7 @@
                     <pic:cNvPicPr/>
                   </pic:nvPicPr>
                   <pic:blipFill>
-                    <a:blip r:embed="rId14"/>
+                    <a:blip r:embed="rId17"/>
                     <a:stretch>
                       <a:fillRect/>
                     </a:stretch>
@@ -594,6 +646,9 @@
         <w:br/>
       </w:r>
       <w:r>
+        <w:rPr>
+          <w:noProof/>
+        </w:rPr>
         <w:drawing>
           <wp:inline distT="0" distB="0" distL="0" distR="0" wp14:anchorId="5C7C1929" wp14:editId="7EF7E38C">
             <wp:extent cx="5219700" cy="3324225"/>
@@ -610,7 +665,7 @@
                     <pic:cNvPicPr/>
                   </pic:nvPicPr>
                   <pic:blipFill>
-                    <a:blip r:embed="rId15"/>
+                    <a:blip r:embed="rId18"/>
                     <a:stretch>
                       <a:fillRect/>
                     </a:stretch>
@@ -654,6 +709,9 @@
         <w:br/>
       </w:r>
       <w:r>
+        <w:rPr>
+          <w:noProof/>
+        </w:rPr>
         <w:drawing>
           <wp:inline distT="0" distB="0" distL="0" distR="0" wp14:anchorId="0678BEC6" wp14:editId="57DC32A7">
             <wp:extent cx="5219700" cy="2697480"/>
@@ -670,7 +728,7 @@
                     <pic:cNvPicPr/>
                   </pic:nvPicPr>
                   <pic:blipFill>
-                    <a:blip r:embed="rId16"/>
+                    <a:blip r:embed="rId19"/>
                     <a:stretch>
                       <a:fillRect/>
                     </a:stretch>
@@ -724,7 +782,7 @@
                     </pic:cNvPicPr>
                   </pic:nvPicPr>
                   <pic:blipFill>
-                    <a:blip r:embed="rId17" cstate="print">
+                    <a:blip r:embed="rId20" cstate="print">
                       <a:extLst>
                         <a:ext uri="{28A0092B-C50C-407E-A947-70E740481C1C}">
                           <a14:useLocalDpi xmlns:a14="http://schemas.microsoft.com/office/drawing/2010/main" val="0"/>
@@ -796,188 +854,69 @@
       </w:r>
     </w:p>
     <w:p>
-      <w:r>
-        <w:t>“</w:t>
-      </w:r>
-      <w:r>
-        <w:t>Actúa como un Desarrollador Web Senior, Arquitecto de Software y experto en DevOps.</w:t>
-      </w:r>
-    </w:p>
-    <w:p>
-      <w:r>
-        <w:t xml:space="preserve">Vamos a construir desde cero </w:t>
-      </w:r>
-      <w:proofErr w:type="spellStart"/>
-      <w:r>
-        <w:t>Latamtradex</w:t>
-      </w:r>
-      <w:proofErr w:type="spellEnd"/>
-      <w:r>
-        <w:t>, una plataforma web que funciona como operador logístico para conectar proveedores locales con compradores en el exterior.</w:t>
-      </w:r>
-    </w:p>
-    <w:p/>
-    <w:p>
-      <w:r>
-        <w:t xml:space="preserve">Descripción del proyecto: </w:t>
-      </w:r>
-      <w:proofErr w:type="spellStart"/>
-      <w:r>
-        <w:t>Latamtradex</w:t>
-      </w:r>
-      <w:proofErr w:type="spellEnd"/>
-      <w:r>
-        <w:t xml:space="preserve"> </w:t>
-      </w:r>
-      <w:proofErr w:type="spellStart"/>
-      <w:r>
-        <w:t>Latamtradex</w:t>
-      </w:r>
-      <w:proofErr w:type="spellEnd"/>
-      <w:r>
-        <w:t xml:space="preserve"> es una aplicación web full-</w:t>
-      </w:r>
-      <w:proofErr w:type="spellStart"/>
-      <w:r>
-        <w:t>stack</w:t>
-      </w:r>
-      <w:proofErr w:type="spellEnd"/>
-      <w:r>
-        <w:t xml:space="preserve"> diseñada para actuar como un nexo logístico estratégico entre proveedores locales de productos y compradores en el exterior (ej. Chile, Perú). La plataforma elimina fricciones aduaneras sirviendo como operador logístico profesional. Permite a los compradores visualizar un catálogo de productos con certificaciones de calidad para exportación y solicitar cotizaciones logísticas integrales. Además, ofrece un entorno seguro para que los proveedores gestionen su documentación técnica y un módulo </w:t>
-      </w:r>
-      <w:r>
-        <w:lastRenderedPageBreak/>
-        <w:t>transaccional para la contratación de asesorías especializadas en apertura de nuevos mercados.</w:t>
-      </w:r>
-    </w:p>
-    <w:p>
-      <w:r>
-        <w:t>Arquitectura y Stack Tecnológico</w:t>
-      </w:r>
-    </w:p>
-    <w:p>
-      <w:r>
-        <w:t>Framework Principal: Next.js (</w:t>
-      </w:r>
-      <w:proofErr w:type="spellStart"/>
-      <w:r>
-        <w:t>React</w:t>
-      </w:r>
-      <w:proofErr w:type="spellEnd"/>
-      <w:r>
-        <w:t xml:space="preserve"> + Node.js)</w:t>
-      </w:r>
-    </w:p>
-    <w:p>
-      <w:r>
-        <w:t xml:space="preserve">Lenguaje: </w:t>
-      </w:r>
-      <w:proofErr w:type="spellStart"/>
-      <w:r>
-        <w:t>TypeScript</w:t>
-      </w:r>
-      <w:proofErr w:type="spellEnd"/>
-    </w:p>
-    <w:p>
-      <w:r>
-        <w:t>Base de datos: SQLite</w:t>
-      </w:r>
-    </w:p>
-    <w:p>
-      <w:r>
-        <w:t>ORM: Prisma ORM (para facilitar la interacción con la base de datos)</w:t>
-      </w:r>
-    </w:p>
-    <w:p>
-      <w:r>
-        <w:t>Estilos: Tailwind CSS (para agilizar el diseño de interfaces)</w:t>
-      </w:r>
-    </w:p>
-    <w:p>
-      <w:r>
-        <w:t xml:space="preserve">Despliegue y Automatización: Contenedores con Docker y Docker </w:t>
-      </w:r>
-      <w:proofErr w:type="spellStart"/>
-      <w:r>
-        <w:t>Compose</w:t>
-      </w:r>
-      <w:proofErr w:type="spellEnd"/>
-      <w:r>
-        <w:t xml:space="preserve"> para garantizar un entorno de desarrollo reproducible y facilitar el despliegue.</w:t>
-      </w:r>
-    </w:p>
-    <w:p>
-      <w:r>
-        <w:t>Requisitos mínimos y funcionalidades esenciales (Desarrollo Modular)</w:t>
-      </w:r>
-    </w:p>
-    <w:p>
-      <w:r>
-        <w:t xml:space="preserve">Módulo de Autenticación y Usuarios: Sistema de registro y </w:t>
-      </w:r>
-      <w:proofErr w:type="spellStart"/>
-      <w:r>
-        <w:t>login</w:t>
-      </w:r>
-      <w:proofErr w:type="spellEnd"/>
-      <w:r>
-        <w:t xml:space="preserve"> (separando roles de administrador/</w:t>
-      </w:r>
-      <w:proofErr w:type="spellStart"/>
-      <w:r>
-        <w:t>Latamtradex</w:t>
-      </w:r>
-      <w:proofErr w:type="spellEnd"/>
-      <w:r>
-        <w:t>, proveedor y comprador).</w:t>
-      </w:r>
-    </w:p>
-    <w:p>
-      <w:r>
-        <w:t xml:space="preserve">Catálogo de Productos Público: Interfaz donde se listen los productos disponibles para exportación sin requerir membresía o </w:t>
-      </w:r>
-      <w:proofErr w:type="spellStart"/>
-      <w:r>
-        <w:t>login</w:t>
-      </w:r>
-      <w:proofErr w:type="spellEnd"/>
-      <w:r>
-        <w:t xml:space="preserve"> previo para su visualización.</w:t>
-      </w:r>
-    </w:p>
-    <w:p>
-      <w:r>
-        <w:t>Gestión de Documentación (Proveedores): Funcionalidad privada para que los proveedores suban documentos que certifiquen la calidad y viabilidad de exportación de sus productos.</w:t>
-      </w:r>
-    </w:p>
-    <w:p>
-      <w:r>
-        <w:t xml:space="preserve">Sistema de Cotización (Nexo Logístico): Formulario integrado en los productos para que un comprador solicite una cotización. La solicitud es gestionada por </w:t>
-      </w:r>
-      <w:proofErr w:type="spellStart"/>
-      <w:r>
-        <w:t>Latamtradex</w:t>
-      </w:r>
-      <w:proofErr w:type="spellEnd"/>
-      <w:r>
-        <w:t>, quien aporta la información aduanera.</w:t>
-      </w:r>
-    </w:p>
-    <w:p>
-      <w:r>
-        <w:t>Módulo de Asesorías y Pasarela de Pago: Sección de servicios (certificación y nuevos mercados) con integración de una pasarela de pago básica (ej. modo prueba de Stripe) para la contratación de dichos servicios.</w:t>
-      </w:r>
-      <w:r>
-        <w:t>”</w:t>
-      </w:r>
-    </w:p>
-    <w:p>
-      <w:pPr>
-        <w:rPr>
-          <w:b/>
-          <w:bCs/>
-        </w:rPr>
-      </w:pPr>
+      <w:pPr>
+        <w:jc w:val="left"/>
+      </w:pPr>
+      <w:r>
+        <w:t xml:space="preserve">El </w:t>
+      </w:r>
+      <w:proofErr w:type="spellStart"/>
+      <w:r>
+        <w:t>prompt</w:t>
+      </w:r>
+      <w:proofErr w:type="spellEnd"/>
+      <w:r>
+        <w:t xml:space="preserve"> inicial de la aplicación se encuentra en el siguiente </w:t>
+      </w:r>
+      <w:proofErr w:type="gramStart"/>
+      <w:r>
+        <w:t>link</w:t>
+      </w:r>
+      <w:proofErr w:type="gramEnd"/>
+      <w:r>
+        <w:t xml:space="preserve">: </w:t>
+      </w:r>
+      <w:hyperlink r:id="rId21" w:history="1">
+        <w:r>
+          <w:rPr>
+            <w:rStyle w:val="Hyperlink"/>
+          </w:rPr>
+          <w:t>https://github.com/juank704/latamtradex-generativecode/blob/main/docs/registro_prompts.txt</w:t>
+        </w:r>
+      </w:hyperlink>
+      <w:r>
+        <w:t xml:space="preserve"> junto con </w:t>
+      </w:r>
+      <w:proofErr w:type="gramStart"/>
+      <w:r>
+        <w:t>todas la iteraciones realizadas</w:t>
+      </w:r>
+      <w:proofErr w:type="gramEnd"/>
+      <w:r>
+        <w:t xml:space="preserve">. En total fueron 10 iteraciones para tener un producto mínimamente funcional utilizando Claude </w:t>
+      </w:r>
+      <w:proofErr w:type="spellStart"/>
+      <w:r>
+        <w:t>code</w:t>
+      </w:r>
+      <w:proofErr w:type="spellEnd"/>
+      <w:r>
+        <w:t xml:space="preserve"> y el Modelo de Opus 4.8</w:t>
+      </w:r>
+      <w:r>
+        <w:t xml:space="preserve">. en ese apartado se expondrá los </w:t>
+      </w:r>
+      <w:proofErr w:type="gramStart"/>
+      <w:r>
+        <w:t>puntos mas relevante</w:t>
+      </w:r>
+      <w:proofErr w:type="gramEnd"/>
+      <w:r>
+        <w:t xml:space="preserve"> de la conversación de la IA</w:t>
+      </w:r>
+      <w:r>
+        <w:br/>
+      </w:r>
       <w:r>
         <w:br/>
       </w:r>
@@ -993,7 +932,21 @@
           <w:b/>
           <w:bCs/>
         </w:rPr>
-        <w:t>RESPUESTA IA:</w:t>
+        <w:t>RESPUESTA IA</w:t>
+      </w:r>
+      <w:r>
+        <w:rPr>
+          <w:b/>
+          <w:bCs/>
+        </w:rPr>
+        <w:t xml:space="preserve"> NUMERO 1</w:t>
+      </w:r>
+      <w:r>
+        <w:rPr>
+          <w:b/>
+          <w:bCs/>
+        </w:rPr>
+        <w:t>:</w:t>
       </w:r>
     </w:p>
     <w:p>
@@ -1009,200 +962,158 @@
         <w:t xml:space="preserve"> ya está construido de extremo a extremo. Resumen de lo entregado:</w:t>
       </w:r>
     </w:p>
+    <w:p>
+      <w:r>
+        <w:t>Estructura del proyecto</w:t>
+      </w:r>
+    </w:p>
+    <w:p>
+      <w:r>
+        <w:t xml:space="preserve">59 archivos organizados en una arquitectura modular de Next.js 14 (App </w:t>
+      </w:r>
+      <w:proofErr w:type="spellStart"/>
+      <w:r>
+        <w:t>Router</w:t>
+      </w:r>
+      <w:proofErr w:type="spellEnd"/>
+      <w:r>
+        <w:t xml:space="preserve"> + RSC) con </w:t>
+      </w:r>
+      <w:proofErr w:type="spellStart"/>
+      <w:r>
+        <w:t>TypeScript</w:t>
+      </w:r>
+      <w:proofErr w:type="spellEnd"/>
+      <w:r>
+        <w:t>, Prisma + SQLite, Tailwind y Stripe.</w:t>
+      </w:r>
+    </w:p>
     <w:p/>
     <w:p>
       <w:r>
-        <w:lastRenderedPageBreak/>
-        <w:t>Estructura del proyecto</w:t>
-      </w:r>
-    </w:p>
-    <w:p>
-      <w:r>
-        <w:t xml:space="preserve">59 archivos organizados en una arquitectura modular de Next.js 14 (App </w:t>
-      </w:r>
-      <w:proofErr w:type="spellStart"/>
-      <w:r>
-        <w:t>Router</w:t>
-      </w:r>
-      <w:proofErr w:type="spellEnd"/>
-      <w:r>
-        <w:t xml:space="preserve"> + RSC) con </w:t>
-      </w:r>
-      <w:proofErr w:type="spellStart"/>
-      <w:r>
-        <w:t>TypeScript</w:t>
-      </w:r>
-      <w:proofErr w:type="spellEnd"/>
-      <w:r>
-        <w:t>, Prisma + SQLite, Tailwind y Stripe.</w:t>
+        <w:t>Módulos implementados (los 5 requisitos)</w:t>
+      </w:r>
+    </w:p>
+    <w:p>
+      <w:r>
+        <w:t>Autenticación con roles (</w:t>
+      </w:r>
+      <w:proofErr w:type="spellStart"/>
+      <w:r>
+        <w:t>src</w:t>
+      </w:r>
+      <w:proofErr w:type="spellEnd"/>
+      <w:r>
+        <w:t>/</w:t>
+      </w:r>
+      <w:proofErr w:type="spellStart"/>
+      <w:r>
+        <w:t>lib</w:t>
+      </w:r>
+      <w:proofErr w:type="spellEnd"/>
+      <w:r>
+        <w:t>/</w:t>
+      </w:r>
+      <w:proofErr w:type="spellStart"/>
+      <w:r>
+        <w:t>auth.ts</w:t>
+      </w:r>
+      <w:proofErr w:type="spellEnd"/>
+      <w:r>
+        <w:t xml:space="preserve">, </w:t>
+      </w:r>
+      <w:proofErr w:type="spellStart"/>
+      <w:r>
+        <w:t>src</w:t>
+      </w:r>
+      <w:proofErr w:type="spellEnd"/>
+      <w:r>
+        <w:t>/</w:t>
+      </w:r>
+      <w:proofErr w:type="gramStart"/>
+      <w:r>
+        <w:t>app</w:t>
+      </w:r>
+      <w:proofErr w:type="gramEnd"/>
+      <w:r>
+        <w:t>/api/</w:t>
+      </w:r>
+      <w:proofErr w:type="spellStart"/>
+      <w:r>
+        <w:t>auth</w:t>
+      </w:r>
+      <w:proofErr w:type="spellEnd"/>
+      <w:r>
+        <w:t xml:space="preserve">/, </w:t>
+      </w:r>
+      <w:proofErr w:type="spellStart"/>
+      <w:r>
+        <w:t>src</w:t>
+      </w:r>
+      <w:proofErr w:type="spellEnd"/>
+      <w:r>
+        <w:t>/</w:t>
+      </w:r>
+      <w:proofErr w:type="gramStart"/>
+      <w:r>
+        <w:t>app</w:t>
+      </w:r>
+      <w:proofErr w:type="gramEnd"/>
+      <w:r>
+        <w:t>/</w:t>
+      </w:r>
+      <w:proofErr w:type="spellStart"/>
+      <w:r>
+        <w:t>login</w:t>
+      </w:r>
+      <w:proofErr w:type="spellEnd"/>
+      <w:r>
+        <w:t xml:space="preserve">/, </w:t>
+      </w:r>
+      <w:proofErr w:type="spellStart"/>
+      <w:r>
+        <w:t>src</w:t>
+      </w:r>
+      <w:proofErr w:type="spellEnd"/>
+      <w:r>
+        <w:t>/</w:t>
+      </w:r>
+      <w:proofErr w:type="gramStart"/>
+      <w:r>
+        <w:t>app</w:t>
+      </w:r>
+      <w:proofErr w:type="gramEnd"/>
+      <w:r>
+        <w:t>/registro/)</w:t>
       </w:r>
     </w:p>
     <w:p/>
     <w:p>
       <w:r>
-        <w:t>Módulos implementados (los 5 requisitos)</w:t>
-      </w:r>
-    </w:p>
-    <w:p>
-      <w:r>
-        <w:t>Autenticación con roles (</w:t>
-      </w:r>
-      <w:proofErr w:type="spellStart"/>
-      <w:r>
-        <w:t>src</w:t>
-      </w:r>
-      <w:proofErr w:type="spellEnd"/>
-      <w:r>
-        <w:t>/</w:t>
-      </w:r>
-      <w:proofErr w:type="spellStart"/>
-      <w:r>
-        <w:t>lib</w:t>
-      </w:r>
-      <w:proofErr w:type="spellEnd"/>
-      <w:r>
-        <w:t>/</w:t>
-      </w:r>
-      <w:proofErr w:type="spellStart"/>
-      <w:r>
-        <w:t>auth.ts</w:t>
-      </w:r>
-      <w:proofErr w:type="spellEnd"/>
-      <w:r>
-        <w:t xml:space="preserve">, </w:t>
-      </w:r>
-      <w:proofErr w:type="spellStart"/>
-      <w:r>
-        <w:t>src</w:t>
-      </w:r>
-      <w:proofErr w:type="spellEnd"/>
-      <w:r>
-        <w:t>/</w:t>
-      </w:r>
-      <w:proofErr w:type="gramStart"/>
-      <w:r>
-        <w:t>app</w:t>
-      </w:r>
-      <w:proofErr w:type="gramEnd"/>
-      <w:r>
-        <w:t>/api/</w:t>
-      </w:r>
-      <w:proofErr w:type="spellStart"/>
-      <w:r>
-        <w:t>auth</w:t>
-      </w:r>
-      <w:proofErr w:type="spellEnd"/>
-      <w:r>
-        <w:t xml:space="preserve">/, </w:t>
-      </w:r>
-      <w:proofErr w:type="spellStart"/>
-      <w:r>
-        <w:t>src</w:t>
-      </w:r>
-      <w:proofErr w:type="spellEnd"/>
-      <w:r>
-        <w:t>/</w:t>
-      </w:r>
-      <w:proofErr w:type="gramStart"/>
-      <w:r>
-        <w:t>app</w:t>
-      </w:r>
-      <w:proofErr w:type="gramEnd"/>
-      <w:r>
-        <w:t>/</w:t>
-      </w:r>
-      <w:proofErr w:type="spellStart"/>
-      <w:r>
-        <w:t>login</w:t>
-      </w:r>
-      <w:proofErr w:type="spellEnd"/>
-      <w:r>
-        <w:t xml:space="preserve">/, </w:t>
-      </w:r>
-      <w:proofErr w:type="spellStart"/>
-      <w:r>
-        <w:t>src</w:t>
-      </w:r>
-      <w:proofErr w:type="spellEnd"/>
-      <w:r>
-        <w:t>/</w:t>
-      </w:r>
-      <w:proofErr w:type="gramStart"/>
-      <w:r>
-        <w:t>app</w:t>
-      </w:r>
-      <w:proofErr w:type="gramEnd"/>
-      <w:r>
-        <w:t>/registro/)</w:t>
-      </w:r>
-    </w:p>
-    <w:p/>
-    <w:p>
-      <w:pPr>
-        <w:rPr>
-          <w:lang w:val="en-US"/>
-        </w:rPr>
-      </w:pPr>
-      <w:r>
-        <w:rPr>
-          <w:lang w:val="en-US"/>
-        </w:rPr>
-        <w:t xml:space="preserve">JWT </w:t>
-      </w:r>
-      <w:proofErr w:type="spellStart"/>
-      <w:r>
-        <w:rPr>
-          <w:lang w:val="en-US"/>
-        </w:rPr>
-        <w:t>firmado</w:t>
-      </w:r>
-      <w:proofErr w:type="spellEnd"/>
-      <w:r>
-        <w:rPr>
-          <w:lang w:val="en-US"/>
-        </w:rPr>
-        <w:t xml:space="preserve"> con </w:t>
-      </w:r>
-      <w:proofErr w:type="spellStart"/>
-      <w:r>
-        <w:rPr>
-          <w:lang w:val="en-US"/>
-        </w:rPr>
+        <w:t xml:space="preserve">JWT firmado con </w:t>
+      </w:r>
+      <w:proofErr w:type="spellStart"/>
+      <w:r>
         <w:t>jose</w:t>
       </w:r>
       <w:proofErr w:type="spellEnd"/>
       <w:r>
-        <w:rPr>
-          <w:lang w:val="en-US"/>
-        </w:rPr>
-        <w:t xml:space="preserve">, cookies HTTP-only, </w:t>
-      </w:r>
-      <w:proofErr w:type="gramStart"/>
-      <w:r>
-        <w:rPr>
-          <w:lang w:val="en-US"/>
-        </w:rPr>
-        <w:t>hash</w:t>
-      </w:r>
-      <w:proofErr w:type="gramEnd"/>
-      <w:r>
-        <w:rPr>
-          <w:lang w:val="en-US"/>
-        </w:rPr>
-        <w:t xml:space="preserve"> con </w:t>
-      </w:r>
-      <w:proofErr w:type="spellStart"/>
-      <w:r>
-        <w:rPr>
-          <w:lang w:val="en-US"/>
-        </w:rPr>
+        <w:t>, cookies HTTP-</w:t>
+      </w:r>
+      <w:proofErr w:type="spellStart"/>
+      <w:r>
+        <w:t>only</w:t>
+      </w:r>
+      <w:proofErr w:type="spellEnd"/>
+      <w:r>
+        <w:t xml:space="preserve">, hash con </w:t>
+      </w:r>
+      <w:proofErr w:type="spellStart"/>
+      <w:r>
         <w:t>bcryptjs</w:t>
       </w:r>
       <w:proofErr w:type="spellEnd"/>
       <w:r>
-        <w:rPr>
-          <w:lang w:val="en-US"/>
-        </w:rPr>
         <w:t>.</w:t>
       </w:r>
     </w:p>
@@ -1558,7 +1469,6 @@
         <w:rPr>
           <w:lang w:val="en-US"/>
         </w:rPr>
-        <w:lastRenderedPageBreak/>
         <w:t>Dockerfile</w:t>
       </w:r>
       <w:proofErr w:type="spellEnd"/>
@@ -1586,6 +1496,7 @@
     <w:p>
       <w:proofErr w:type="spellStart"/>
       <w:r>
+        <w:lastRenderedPageBreak/>
         <w:t>docker-compose.yml</w:t>
       </w:r>
       <w:proofErr w:type="spellEnd"/>
@@ -1669,44 +1580,40 @@
       <w:proofErr w:type="gramEnd"/>
     </w:p>
     <w:p>
-      <w:pPr>
-        <w:rPr>
-          <w:lang w:val="en-US"/>
-        </w:rPr>
-      </w:pPr>
-      <w:proofErr w:type="spellStart"/>
-      <w:r>
-        <w:rPr>
-          <w:lang w:val="en-US"/>
-        </w:rPr>
+      <w:proofErr w:type="spellStart"/>
+      <w:r>
         <w:t>npx</w:t>
       </w:r>
       <w:proofErr w:type="spellEnd"/>
       <w:r>
-        <w:rPr>
-          <w:lang w:val="en-US"/>
-        </w:rPr>
+        <w:t xml:space="preserve"> prisma </w:t>
+      </w:r>
+      <w:proofErr w:type="spellStart"/>
+      <w:r>
+        <w:t>migrate</w:t>
+      </w:r>
+      <w:proofErr w:type="spellEnd"/>
+      <w:r>
         <w:t xml:space="preserve"> </w:t>
       </w:r>
       <w:proofErr w:type="spellStart"/>
       <w:r>
-        <w:rPr>
-          <w:lang w:val="en-US"/>
-        </w:rPr>
-        <w:t>prisma</w:t>
-      </w:r>
-      <w:proofErr w:type="spellEnd"/>
-      <w:r>
-        <w:rPr>
-          <w:lang w:val="en-US"/>
-        </w:rPr>
-        <w:t xml:space="preserve"> migrate dev --name </w:t>
-      </w:r>
-      <w:proofErr w:type="spellStart"/>
-      <w:r>
-        <w:rPr>
-          <w:lang w:val="en-US"/>
-        </w:rPr>
+        <w:t>dev</w:t>
+      </w:r>
+      <w:proofErr w:type="spellEnd"/>
+      <w:r>
+        <w:t xml:space="preserve"> --</w:t>
+      </w:r>
+      <w:proofErr w:type="spellStart"/>
+      <w:r>
+        <w:t>name</w:t>
+      </w:r>
+      <w:proofErr w:type="spellEnd"/>
+      <w:r>
+        <w:t xml:space="preserve"> </w:t>
+      </w:r>
+      <w:proofErr w:type="spellStart"/>
+      <w:r>
         <w:t>init</w:t>
       </w:r>
       <w:proofErr w:type="spellEnd"/>
@@ -1826,10 +1733,7 @@
     </w:p>
     <w:p>
       <w:r>
-        <w:t>“</w:t>
-      </w:r>
-      <w:r>
-        <w:t xml:space="preserve">Al ejecutar el comando para construir la imagen de Docker, he recibido el siguiente error en el paso de </w:t>
+        <w:t xml:space="preserve">“Al ejecutar el comando para construir la imagen de Docker, he recibido el siguiente error en el paso de </w:t>
       </w:r>
       <w:proofErr w:type="spellStart"/>
       <w:r>
@@ -1852,8 +1756,6 @@
       </w:r>
       <w:r>
         <w:br/>
-      </w:r>
-      <w:r>
         <w:t xml:space="preserve">#19 1.757 Error: Prisma </w:t>
       </w:r>
       <w:proofErr w:type="spellStart"/>
@@ -1941,10 +1843,7 @@
       </w:r>
       <w:proofErr w:type="gramEnd"/>
       <w:r>
-        <w:t>:14</w:t>
-      </w:r>
-      <w:r>
-        <w:t>”</w:t>
+        <w:t>:14”</w:t>
       </w:r>
       <w:r>
         <w:br/>
@@ -1962,10 +1861,7 @@
     </w:p>
     <w:p>
       <w:r>
-        <w:t>“</w:t>
-      </w:r>
-      <w:r>
-        <w:t>Por qué ocurre</w:t>
+        <w:t>“Por qué ocurre</w:t>
       </w:r>
       <w:r>
         <w:t xml:space="preserve"> </w:t>
@@ -2087,6 +1983,7 @@
     </w:p>
     <w:p>
       <w:r>
+        <w:lastRenderedPageBreak/>
         <w:t xml:space="preserve">El </w:t>
       </w:r>
       <w:proofErr w:type="spellStart"/>
@@ -2263,34 +2160,169 @@
     <w:p>
       <w:proofErr w:type="spellStart"/>
       <w:r>
+        <w:t>Added</w:t>
+      </w:r>
+      <w:proofErr w:type="spellEnd"/>
+      <w:r>
+        <w:t xml:space="preserve"> 2 </w:t>
+      </w:r>
+      <w:proofErr w:type="spellStart"/>
+      <w:r>
+        <w:t>lines</w:t>
+      </w:r>
+      <w:proofErr w:type="spellEnd"/>
+    </w:p>
+    <w:p>
+      <w:r>
+        <w:t>Archivos modificados</w:t>
+      </w:r>
+    </w:p>
+    <w:p>
+      <w:proofErr w:type="spellStart"/>
+      <w:proofErr w:type="gramStart"/>
+      <w:r>
+        <w:rPr>
+          <w:lang w:val="en-US"/>
+        </w:rPr>
         <w:lastRenderedPageBreak/>
-        <w:t>Added</w:t>
-      </w:r>
-      <w:proofErr w:type="spellEnd"/>
-      <w:r>
-        <w:t xml:space="preserve"> 2 </w:t>
-      </w:r>
-      <w:proofErr w:type="spellStart"/>
-      <w:r>
-        <w:t>lines</w:t>
-      </w:r>
-      <w:proofErr w:type="spellEnd"/>
-    </w:p>
-    <w:p>
-      <w:r>
-        <w:t>Archivos modificados</w:t>
-      </w:r>
-    </w:p>
-    <w:p>
-      <w:proofErr w:type="spellStart"/>
+        <w:t>package.json</w:t>
+      </w:r>
+      <w:proofErr w:type="spellEnd"/>
+      <w:proofErr w:type="gramEnd"/>
+      <w:r>
+        <w:rPr>
+          <w:lang w:val="en-US"/>
+        </w:rPr>
+        <w:t xml:space="preserve"> — script build </w:t>
+      </w:r>
+      <w:proofErr w:type="spellStart"/>
+      <w:r>
+        <w:rPr>
+          <w:lang w:val="en-US"/>
+        </w:rPr>
+        <w:t>reducido</w:t>
+      </w:r>
+      <w:proofErr w:type="spellEnd"/>
+      <w:r>
+        <w:rPr>
+          <w:lang w:val="en-US"/>
+        </w:rPr>
+        <w:t xml:space="preserve"> a </w:t>
+      </w:r>
+      <w:proofErr w:type="spellStart"/>
+      <w:r>
+        <w:rPr>
+          <w:lang w:val="en-US"/>
+        </w:rPr>
+        <w:t>prisma</w:t>
+      </w:r>
+      <w:proofErr w:type="spellEnd"/>
+      <w:r>
+        <w:rPr>
+          <w:lang w:val="en-US"/>
+        </w:rPr>
+        <w:t xml:space="preserve"> generate &amp;&amp; next build. </w:t>
+      </w:r>
+      <w:r>
+        <w:t xml:space="preserve">Las migraciones ya las aplica el </w:t>
+      </w:r>
+      <w:proofErr w:type="spellStart"/>
+      <w:r>
+        <w:t>entrypoint</w:t>
+      </w:r>
+      <w:proofErr w:type="spellEnd"/>
+      <w:r>
+        <w:t xml:space="preserve"> en </w:t>
+      </w:r>
+      <w:proofErr w:type="spellStart"/>
+      <w:r>
+        <w:t>runtime</w:t>
+      </w:r>
+      <w:proofErr w:type="spellEnd"/>
+      <w:r>
+        <w:t xml:space="preserve"> (prisma </w:t>
+      </w:r>
+      <w:proofErr w:type="spellStart"/>
+      <w:r>
+        <w:t>db</w:t>
+      </w:r>
+      <w:proofErr w:type="spellEnd"/>
+      <w:r>
+        <w:t xml:space="preserve"> </w:t>
+      </w:r>
+      <w:proofErr w:type="spellStart"/>
+      <w:r>
+        <w:t>push</w:t>
+      </w:r>
+      <w:proofErr w:type="spellEnd"/>
+      <w:r>
+        <w:t>).</w:t>
+      </w:r>
+    </w:p>
+    <w:p>
+      <w:proofErr w:type="spellStart"/>
+      <w:r>
+        <w:t>src</w:t>
+      </w:r>
+      <w:proofErr w:type="spellEnd"/>
+      <w:r>
+        <w:t>/app/</w:t>
+      </w:r>
+      <w:proofErr w:type="spellStart"/>
+      <w:r>
+        <w:t>page.tsx</w:t>
+      </w:r>
+      <w:proofErr w:type="spellEnd"/>
+      <w:r>
+        <w:t xml:space="preserve"> — añadido </w:t>
+      </w:r>
+      <w:proofErr w:type="spellStart"/>
+      <w:r>
+        <w:t>export</w:t>
+      </w:r>
+      <w:proofErr w:type="spellEnd"/>
+      <w:r>
+        <w:t xml:space="preserve"> </w:t>
+      </w:r>
+      <w:proofErr w:type="spellStart"/>
+      <w:r>
+        <w:t>const</w:t>
+      </w:r>
+      <w:proofErr w:type="spellEnd"/>
+      <w:r>
+        <w:t xml:space="preserve"> </w:t>
+      </w:r>
+      <w:proofErr w:type="spellStart"/>
+      <w:r>
+        <w:t>dynamic</w:t>
+      </w:r>
+      <w:proofErr w:type="spellEnd"/>
+      <w:r>
+        <w:t xml:space="preserve"> = '</w:t>
+      </w:r>
+      <w:proofErr w:type="spellStart"/>
+      <w:r>
+        <w:t>force-dynamic</w:t>
+      </w:r>
+      <w:proofErr w:type="spellEnd"/>
+      <w:r>
+        <w:t xml:space="preserve">' para evitar que Next intente </w:t>
+      </w:r>
+      <w:proofErr w:type="spellStart"/>
+      <w:r>
+        <w:t>prerenderizar</w:t>
+      </w:r>
+      <w:proofErr w:type="spellEnd"/>
+      <w:r>
+        <w:t xml:space="preserve"> </w:t>
+      </w:r>
       <w:proofErr w:type="gramStart"/>
       <w:r>
-        <w:t>package.json</w:t>
-      </w:r>
-      <w:proofErr w:type="spellEnd"/>
+        <w:t>la home</w:t>
+      </w:r>
       <w:proofErr w:type="gramEnd"/>
       <w:r>
-        <w:t xml:space="preserve"> — script </w:t>
+        <w:t xml:space="preserve"> consultando Prisma durante el </w:t>
       </w:r>
       <w:proofErr w:type="spellStart"/>
       <w:r>
@@ -2298,19 +2330,47 @@
       </w:r>
       <w:proofErr w:type="spellEnd"/>
       <w:r>
-        <w:t xml:space="preserve"> reducido a prisma </w:t>
-      </w:r>
-      <w:proofErr w:type="spellStart"/>
-      <w:r>
-        <w:t>generate</w:t>
-      </w:r>
-      <w:proofErr w:type="spellEnd"/>
-      <w:r>
-        <w:t xml:space="preserve"> &amp;&amp; </w:t>
-      </w:r>
-      <w:proofErr w:type="spellStart"/>
-      <w:r>
-        <w:t>next</w:t>
+        <w:t>.</w:t>
+      </w:r>
+    </w:p>
+    <w:p>
+      <w:proofErr w:type="spellStart"/>
+      <w:r>
+        <w:t>Dockerfile</w:t>
+      </w:r>
+      <w:proofErr w:type="spellEnd"/>
+      <w:r>
+        <w:t xml:space="preserve"> — añadido ENV DATABASE_URL="file</w:t>
+      </w:r>
+      <w:proofErr w:type="gramStart"/>
+      <w:r>
+        <w:t>:./</w:t>
+      </w:r>
+      <w:proofErr w:type="spellStart"/>
+      <w:proofErr w:type="gramEnd"/>
+      <w:r>
+        <w:t>build-placeholder.db</w:t>
+      </w:r>
+      <w:proofErr w:type="spellEnd"/>
+      <w:r>
+        <w:t xml:space="preserve">" en la etapa </w:t>
+      </w:r>
+      <w:proofErr w:type="spellStart"/>
+      <w:r>
+        <w:t>builder</w:t>
+      </w:r>
+      <w:proofErr w:type="spellEnd"/>
+      <w:r>
+        <w:t xml:space="preserve"> como red de seguridad para que cualquier comando de Prisma encuentre la variable durante la compilación.</w:t>
+      </w:r>
+    </w:p>
+    <w:p>
+      <w:r>
+        <w:t xml:space="preserve">Ahora </w:t>
+      </w:r>
+      <w:proofErr w:type="spellStart"/>
+      <w:r>
+        <w:t>docker</w:t>
       </w:r>
       <w:proofErr w:type="spellEnd"/>
       <w:r>
@@ -2318,19 +2378,27 @@
       </w:r>
       <w:proofErr w:type="spellStart"/>
       <w:r>
+        <w:t>compose</w:t>
+      </w:r>
+      <w:proofErr w:type="spellEnd"/>
+      <w:r>
+        <w:t xml:space="preserve"> up --</w:t>
+      </w:r>
+      <w:proofErr w:type="spellStart"/>
+      <w:r>
         <w:t>build</w:t>
       </w:r>
       <w:proofErr w:type="spellEnd"/>
       <w:r>
-        <w:t xml:space="preserve">. Las migraciones ya las aplica el </w:t>
-      </w:r>
-      <w:proofErr w:type="spellStart"/>
-      <w:r>
-        <w:t>entrypoint</w:t>
-      </w:r>
-      <w:proofErr w:type="spellEnd"/>
-      <w:r>
-        <w:t xml:space="preserve"> en </w:t>
+        <w:t xml:space="preserve"> debería completar el </w:t>
+      </w:r>
+      <w:proofErr w:type="spellStart"/>
+      <w:r>
+        <w:t>build</w:t>
+      </w:r>
+      <w:proofErr w:type="spellEnd"/>
+      <w:r>
+        <w:t xml:space="preserve"> correctamente. La DB real se crea en </w:t>
       </w:r>
       <w:proofErr w:type="spellStart"/>
       <w:r>
@@ -2338,188 +2406,22 @@
       </w:r>
       <w:proofErr w:type="spellEnd"/>
       <w:r>
-        <w:t xml:space="preserve"> (prisma </w:t>
-      </w:r>
-      <w:proofErr w:type="spellStart"/>
-      <w:r>
-        <w:t>db</w:t>
-      </w:r>
-      <w:proofErr w:type="spellEnd"/>
-      <w:r>
-        <w:t xml:space="preserve"> </w:t>
-      </w:r>
-      <w:proofErr w:type="spellStart"/>
-      <w:r>
-        <w:t>push</w:t>
-      </w:r>
-      <w:proofErr w:type="spellEnd"/>
-      <w:r>
-        <w:t>).</w:t>
-      </w:r>
-    </w:p>
-    <w:p>
-      <w:proofErr w:type="spellStart"/>
-      <w:r>
-        <w:t>src</w:t>
-      </w:r>
-      <w:proofErr w:type="spellEnd"/>
-      <w:r>
-        <w:t>/app/</w:t>
-      </w:r>
-      <w:proofErr w:type="spellStart"/>
-      <w:r>
-        <w:t>page.tsx</w:t>
-      </w:r>
-      <w:proofErr w:type="spellEnd"/>
-      <w:r>
-        <w:t xml:space="preserve"> — añadido </w:t>
-      </w:r>
-      <w:proofErr w:type="spellStart"/>
-      <w:r>
-        <w:t>export</w:t>
-      </w:r>
-      <w:proofErr w:type="spellEnd"/>
-      <w:r>
-        <w:t xml:space="preserve"> </w:t>
-      </w:r>
-      <w:proofErr w:type="spellStart"/>
-      <w:r>
-        <w:t>const</w:t>
-      </w:r>
-      <w:proofErr w:type="spellEnd"/>
-      <w:r>
-        <w:t xml:space="preserve"> </w:t>
-      </w:r>
-      <w:proofErr w:type="spellStart"/>
-      <w:r>
-        <w:t>dynamic</w:t>
-      </w:r>
-      <w:proofErr w:type="spellEnd"/>
-      <w:r>
-        <w:t xml:space="preserve"> = '</w:t>
-      </w:r>
-      <w:proofErr w:type="spellStart"/>
-      <w:r>
-        <w:t>force-dynamic</w:t>
-      </w:r>
-      <w:proofErr w:type="spellEnd"/>
-      <w:r>
-        <w:t xml:space="preserve">' para evitar que Next intente </w:t>
-      </w:r>
-      <w:proofErr w:type="spellStart"/>
-      <w:r>
-        <w:t>prerenderizar</w:t>
-      </w:r>
-      <w:proofErr w:type="spellEnd"/>
-      <w:r>
-        <w:t xml:space="preserve"> </w:t>
+        <w:t xml:space="preserve"> sobre el volumen </w:t>
+      </w:r>
+      <w:proofErr w:type="spellStart"/>
+      <w:r>
+        <w:t>latamtradex-db</w:t>
+      </w:r>
+      <w:proofErr w:type="spellEnd"/>
+      <w:r>
+        <w:t xml:space="preserve"> montado en /</w:t>
       </w:r>
       <w:proofErr w:type="gramStart"/>
       <w:r>
-        <w:t>la home</w:t>
+        <w:t>app</w:t>
       </w:r>
       <w:proofErr w:type="gramEnd"/>
       <w:r>
-        <w:t xml:space="preserve"> consultando Prisma durante el </w:t>
-      </w:r>
-      <w:proofErr w:type="spellStart"/>
-      <w:r>
-        <w:t>build</w:t>
-      </w:r>
-      <w:proofErr w:type="spellEnd"/>
-      <w:r>
-        <w:t>.</w:t>
-      </w:r>
-    </w:p>
-    <w:p>
-      <w:proofErr w:type="spellStart"/>
-      <w:r>
-        <w:t>Dockerfile</w:t>
-      </w:r>
-      <w:proofErr w:type="spellEnd"/>
-      <w:r>
-        <w:t xml:space="preserve"> — añadido ENV DATABASE_URL="file</w:t>
-      </w:r>
-      <w:proofErr w:type="gramStart"/>
-      <w:r>
-        <w:t>:./</w:t>
-      </w:r>
-      <w:proofErr w:type="spellStart"/>
-      <w:proofErr w:type="gramEnd"/>
-      <w:r>
-        <w:t>build-placeholder.db</w:t>
-      </w:r>
-      <w:proofErr w:type="spellEnd"/>
-      <w:r>
-        <w:t xml:space="preserve">" en la etapa </w:t>
-      </w:r>
-      <w:proofErr w:type="spellStart"/>
-      <w:r>
-        <w:t>builder</w:t>
-      </w:r>
-      <w:proofErr w:type="spellEnd"/>
-      <w:r>
-        <w:t xml:space="preserve"> como red de seguridad para que cualquier comando de Prisma encuentre la variable durante la compilación.</w:t>
-      </w:r>
-    </w:p>
-    <w:p>
-      <w:r>
-        <w:t xml:space="preserve">Ahora </w:t>
-      </w:r>
-      <w:proofErr w:type="spellStart"/>
-      <w:r>
-        <w:t>docker</w:t>
-      </w:r>
-      <w:proofErr w:type="spellEnd"/>
-      <w:r>
-        <w:t xml:space="preserve"> </w:t>
-      </w:r>
-      <w:proofErr w:type="spellStart"/>
-      <w:r>
-        <w:t>compose</w:t>
-      </w:r>
-      <w:proofErr w:type="spellEnd"/>
-      <w:r>
-        <w:t xml:space="preserve"> up --</w:t>
-      </w:r>
-      <w:proofErr w:type="spellStart"/>
-      <w:r>
-        <w:t>build</w:t>
-      </w:r>
-      <w:proofErr w:type="spellEnd"/>
-      <w:r>
-        <w:t xml:space="preserve"> debería completar el </w:t>
-      </w:r>
-      <w:proofErr w:type="spellStart"/>
-      <w:r>
-        <w:t>build</w:t>
-      </w:r>
-      <w:proofErr w:type="spellEnd"/>
-      <w:r>
-        <w:t xml:space="preserve"> correctamente. La DB real se crea en </w:t>
-      </w:r>
-      <w:proofErr w:type="spellStart"/>
-      <w:r>
-        <w:t>runtime</w:t>
-      </w:r>
-      <w:proofErr w:type="spellEnd"/>
-      <w:r>
-        <w:t xml:space="preserve"> sobre el volumen </w:t>
-      </w:r>
-      <w:proofErr w:type="spellStart"/>
-      <w:r>
-        <w:t>latamtradex-db</w:t>
-      </w:r>
-      <w:proofErr w:type="spellEnd"/>
-      <w:r>
-        <w:t xml:space="preserve"> montado en /</w:t>
-      </w:r>
-      <w:proofErr w:type="gramStart"/>
-      <w:r>
-        <w:t>app</w:t>
-      </w:r>
-      <w:proofErr w:type="gramEnd"/>
-      <w:r>
         <w:t>/data/</w:t>
       </w:r>
       <w:proofErr w:type="spellStart"/>
@@ -2528,10 +2430,7 @@
       </w:r>
       <w:proofErr w:type="spellEnd"/>
       <w:r>
-        <w:t>.</w:t>
-      </w:r>
-      <w:r>
-        <w:t xml:space="preserve">” </w:t>
+        <w:t xml:space="preserve">.” </w:t>
       </w:r>
       <w:r>
         <w:br/>
@@ -2605,11 +2504,11 @@
       </w:r>
       <w:proofErr w:type="spellEnd"/>
       <w:r>
-        <w:t xml:space="preserve"> o Prisma en la máquina local. Se le instruyó que cualquier interacción con la base de datos (como la migración </w:t>
+        <w:t xml:space="preserve"> o Prisma en la máquina local. Se le instruyó que cualquier interacción con la base de datos (como la migración planificada v2_aprobacion_y_ordenes_compra) debía encapsularse obligatoriamente utilizando comandos de ejecución en contenedores, </w:t>
       </w:r>
       <w:r>
         <w:lastRenderedPageBreak/>
-        <w:t xml:space="preserve">planificada v2_aprobacion_y_ordenes_compra) debía encapsularse obligatoriamente utilizando comandos de ejecución en contenedores, específicamente a través de </w:t>
+        <w:t xml:space="preserve">específicamente a través de </w:t>
       </w:r>
       <w:proofErr w:type="spellStart"/>
       <w:r>
@@ -2676,10 +2575,7 @@
     </w:p>
     <w:p>
       <w:r>
-        <w:t>“</w:t>
-      </w:r>
-      <w:r>
-        <w:t xml:space="preserve">Para cualquier comando que necesites ejecutar (como migraciones de Prisma, el script de </w:t>
+        <w:t xml:space="preserve">“Para cualquier comando que necesites ejecutar (como migraciones de Prisma, el script de </w:t>
       </w:r>
       <w:proofErr w:type="spellStart"/>
       <w:r>
@@ -2743,10 +2639,7 @@
       </w:r>
       <w:proofErr w:type="spellEnd"/>
       <w:r>
-        <w:t>).</w:t>
-      </w:r>
-      <w:r>
-        <w:t>”</w:t>
+        <w:t>).”</w:t>
       </w:r>
       <w:r>
         <w:br/>
@@ -2827,18 +2720,23 @@
         <w:br/>
       </w:r>
     </w:p>
+    <w:p/>
+    <w:p/>
+    <w:p/>
+    <w:p/>
+    <w:p/>
     <w:p>
       <w:pPr>
         <w:pStyle w:val="TtuloApartado2"/>
       </w:pPr>
       <w:r>
+        <w:lastRenderedPageBreak/>
         <w:t>Análisis de resultados y conclusiones</w:t>
       </w:r>
     </w:p>
     <w:p/>
     <w:p>
       <w:r>
-        <w:lastRenderedPageBreak/>
         <w:t>La experiencia de diseñar y desarrollar la plataforma "</w:t>
       </w:r>
       <w:proofErr w:type="spellStart"/>
@@ -2855,32 +2753,23 @@
       </w:r>
       <w:proofErr w:type="gramEnd"/>
       <w:r>
-        <w:t xml:space="preserve"> ha demostrado que es viable construir software funcional y complejo interactuando exclusivamente con inteligencia artificial. Sin embargo, este enfoque transforma el rol del programador tradicional hacia arquitecto de software, donde la habilidad principal recae en la</w:t>
-      </w:r>
+        <w:t xml:space="preserve"> ha demostrado que es viable construir software funcional y complejo interactuando exclusivamente con inteligencia artificial. Sin embargo, este enfoque transforma el rol del programador tradicional hacia arquitecto de software, donde la habilidad principal recae en la formulación de instrucciones (</w:t>
+      </w:r>
+      <w:proofErr w:type="spellStart"/>
+      <w:r>
+        <w:t>prompt</w:t>
+      </w:r>
+      <w:proofErr w:type="spellEnd"/>
       <w:r>
         <w:t xml:space="preserve"> </w:t>
       </w:r>
-      <w:r>
-        <w:t>formulación de instrucciones (</w:t>
-      </w:r>
-      <w:proofErr w:type="spellStart"/>
-      <w:r>
-        <w:t>prompt</w:t>
-      </w:r>
-      <w:proofErr w:type="spellEnd"/>
-      <w:r>
-        <w:t xml:space="preserve"> </w:t>
-      </w:r>
       <w:proofErr w:type="spellStart"/>
       <w:r>
         <w:t>engineering</w:t>
       </w:r>
       <w:proofErr w:type="spellEnd"/>
       <w:r>
-        <w:t>)</w:t>
-      </w:r>
-      <w:r>
-        <w:t>.</w:t>
+        <w:t>).</w:t>
       </w:r>
       <w:r>
         <w:br/>
@@ -2948,6 +2837,7 @@
         </w:numPr>
       </w:pPr>
       <w:r>
+        <w:lastRenderedPageBreak/>
         <w:t xml:space="preserve">Conflictos de versiones en dependencias: Durante la integración de la pasarela de pagos, la IA generó el código utilizando una versión antigua de la API de Stripe </w:t>
       </w:r>
       <w:proofErr w:type="spellStart"/>
@@ -2964,11 +2854,7 @@
       </w:r>
       <w:proofErr w:type="gramEnd"/>
       <w:r>
-        <w:t xml:space="preserve">). Sin embargo, al inicializar el </w:t>
-      </w:r>
-      <w:r>
-        <w:lastRenderedPageBreak/>
-        <w:t xml:space="preserve">proyecto, el gestor de paquetes </w:t>
+        <w:t xml:space="preserve">). Sin embargo, al inicializar el proyecto, el gestor de paquetes </w:t>
       </w:r>
       <w:proofErr w:type="spellStart"/>
       <w:r>
@@ -3140,7 +3026,11 @@
       </w:r>
       <w:proofErr w:type="gramEnd"/>
       <w:r>
-        <w:t>. Ante esta instrucción, el agente demostró una notable capacidad de razonamiento autónomo: identificó que aplicar migraciones versionadas (</w:t>
+        <w:t xml:space="preserve">. Ante esta instrucción, </w:t>
+      </w:r>
+      <w:r>
+        <w:lastRenderedPageBreak/>
+        <w:t>el agente demostró una notable capacidad de razonamiento autónomo: identificó que aplicar migraciones versionadas (</w:t>
       </w:r>
       <w:proofErr w:type="spellStart"/>
       <w:r>
@@ -3172,11 +3062,7 @@
       </w:r>
       <w:proofErr w:type="spellEnd"/>
       <w:r>
-        <w:t xml:space="preserve">) de la base de datos, y optó </w:t>
-      </w:r>
-      <w:r>
-        <w:lastRenderedPageBreak/>
-        <w:t xml:space="preserve">proactivamente por utilizar prisma </w:t>
+        <w:t xml:space="preserve">) de la base de datos, y optó proactivamente por utilizar prisma </w:t>
       </w:r>
       <w:proofErr w:type="spellStart"/>
       <w:r>
@@ -3223,8 +3109,8 @@
     </w:p>
     <w:p/>
     <w:sectPr>
-      <w:headerReference w:type="default" r:id="rId18"/>
-      <w:footerReference w:type="default" r:id="rId19"/>
+      <w:headerReference w:type="default" r:id="rId22"/>
+      <w:footerReference w:type="default" r:id="rId23"/>
       <w:pgSz w:w="11906" w:h="16838" w:code="9"/>
       <w:pgMar w:top="1418" w:right="1843" w:bottom="1418" w:left="1843" w:header="1134" w:footer="397" w:gutter="0"/>
       <w:cols w:space="708"/>
@@ -6625,6 +6511,7 @@
   <w:style w:type="character" w:default="1" w:styleId="DefaultParagraphFont">
     <w:name w:val="Default Paragraph Font"/>
     <w:uiPriority w:val="1"/>
+    <w:semiHidden/>
     <w:unhideWhenUsed/>
   </w:style>
   <w:style w:type="table" w:default="1" w:styleId="TableNormal">
@@ -8110,30 +7997,15 @@
 </file>
 
 <file path=customXml/item1.xml><?xml version="1.0" encoding="utf-8"?>
-<b:Sources xmlns:b="http://schemas.openxmlformats.org/officeDocument/2006/bibliography" xmlns="http://schemas.openxmlformats.org/officeDocument/2006/bibliography" SelectedStyle="\APASixthEditionOfficeOnline.xsl" StyleName="APA" Version="6"/>
+<?mso-contentType ?>
+<FormTemplates xmlns="http://schemas.microsoft.com/sharepoint/v3/contenttype/forms">
+  <Display>DocumentLibraryForm</Display>
+  <Edit>DocumentLibraryForm</Edit>
+  <New>DocumentLibraryForm</New>
+</FormTemplates>
 </file>
 
 <file path=customXml/item2.xml><?xml version="1.0" encoding="utf-8"?>
-<p:properties xmlns:p="http://schemas.microsoft.com/office/2006/metadata/properties" xmlns:xsi="http://www.w3.org/2001/XMLSchema-instance" xmlns:pc="http://schemas.microsoft.com/office/infopath/2007/PartnerControls">
-  <documentManagement>
-    <lcf76f155ced4ddcb4097134ff3c332f xmlns="27c1adeb-3674-457c-b08c-8a73f31b6e23">
-      <Terms xmlns="http://schemas.microsoft.com/office/infopath/2007/PartnerControls"/>
-    </lcf76f155ced4ddcb4097134ff3c332f>
-    <TaxCatchAll xmlns="0a70e875-3d35-4be2-921f-7117c31bab9b" xsi:nil="true"/>
-    <MediaLengthInSeconds xmlns="27c1adeb-3674-457c-b08c-8a73f31b6e23" xsi:nil="true"/>
-    <SharedWithUsers xmlns="0a70e875-3d35-4be2-921f-7117c31bab9b">
-      <UserInfo>
-        <DisplayName/>
-        <AccountId xsi:nil="true"/>
-        <AccountType/>
-      </UserInfo>
-    </SharedWithUsers>
-    <_Flow_SignoffStatus xmlns="27c1adeb-3674-457c-b08c-8a73f31b6e23" xsi:nil="true"/>
-  </documentManagement>
-</p:properties>
-</file>
-
-<file path=customXml/item3.xml><?xml version="1.0" encoding="utf-8"?>
 <ct:contentTypeSchema xmlns:ct="http://schemas.microsoft.com/office/2006/metadata/contentType" xmlns:ma="http://schemas.microsoft.com/office/2006/metadata/properties/metaAttributes" ct:_="" ma:_="" ma:contentTypeName="Documento" ma:contentTypeID="0x010100DF3D7C797EA12745A270EF30E38719B9" ma:contentTypeVersion="20" ma:contentTypeDescription="Crear nuevo documento." ma:contentTypeScope="" ma:versionID="98b23ce13f8ef13134c980882a27b8cc">
   <xsd:schema xmlns:xsd="http://www.w3.org/2001/XMLSchema" xmlns:xs="http://www.w3.org/2001/XMLSchema" xmlns:p="http://schemas.microsoft.com/office/2006/metadata/properties" xmlns:ns2="0a70e875-3d35-4be2-921f-7117c31bab9b" xmlns:ns3="27c1adeb-3674-457c-b08c-8a73f31b6e23" targetNamespace="http://schemas.microsoft.com/office/2006/metadata/properties" ma:root="true" ma:fieldsID="83d50475b18a8f95f7f8edf1c6caa3f2" ns2:_="" ns3:_="">
     <xsd:import namespace="0a70e875-3d35-4be2-921f-7117c31bab9b"/>
@@ -8400,35 +8272,39 @@
 </ct:contentTypeSchema>
 </file>
 
+<file path=customXml/item3.xml><?xml version="1.0" encoding="utf-8"?>
+<p:properties xmlns:p="http://schemas.microsoft.com/office/2006/metadata/properties" xmlns:xsi="http://www.w3.org/2001/XMLSchema-instance" xmlns:pc="http://schemas.microsoft.com/office/infopath/2007/PartnerControls">
+  <documentManagement>
+    <lcf76f155ced4ddcb4097134ff3c332f xmlns="27c1adeb-3674-457c-b08c-8a73f31b6e23">
+      <Terms xmlns="http://schemas.microsoft.com/office/infopath/2007/PartnerControls"/>
+    </lcf76f155ced4ddcb4097134ff3c332f>
+    <TaxCatchAll xmlns="0a70e875-3d35-4be2-921f-7117c31bab9b" xsi:nil="true"/>
+    <MediaLengthInSeconds xmlns="27c1adeb-3674-457c-b08c-8a73f31b6e23" xsi:nil="true"/>
+    <SharedWithUsers xmlns="0a70e875-3d35-4be2-921f-7117c31bab9b">
+      <UserInfo>
+        <DisplayName/>
+        <AccountId xsi:nil="true"/>
+        <AccountType/>
+      </UserInfo>
+    </SharedWithUsers>
+    <_Flow_SignoffStatus xmlns="27c1adeb-3674-457c-b08c-8a73f31b6e23" xsi:nil="true"/>
+  </documentManagement>
+</p:properties>
+</file>
+
 <file path=customXml/item4.xml><?xml version="1.0" encoding="utf-8"?>
-<?mso-contentType ?>
-<FormTemplates xmlns="http://schemas.microsoft.com/sharepoint/v3/contenttype/forms">
-  <Display>DocumentLibraryForm</Display>
-  <Edit>DocumentLibraryForm</Edit>
-  <New>DocumentLibraryForm</New>
-</FormTemplates>
+<b:Sources xmlns:b="http://schemas.openxmlformats.org/officeDocument/2006/bibliography" xmlns="http://schemas.openxmlformats.org/officeDocument/2006/bibliography" SelectedStyle="\APASixthEditionOfficeOnline.xsl" StyleName="APA" Version="6"/>
 </file>
 
 <file path=customXml/itemProps1.xml><?xml version="1.0" encoding="utf-8"?>
-<ds:datastoreItem xmlns:ds="http://schemas.openxmlformats.org/officeDocument/2006/customXml" ds:itemID="{ED64A034-5F71-460F-B8D2-7705D0E3A65B}">
+<ds:datastoreItem xmlns:ds="http://schemas.openxmlformats.org/officeDocument/2006/customXml" ds:itemID="{8D9D84D8-2D2F-4DC4-A93D-919C34237140}">
   <ds:schemaRefs>
-    <ds:schemaRef ds:uri="http://schemas.openxmlformats.org/officeDocument/2006/bibliography"/>
+    <ds:schemaRef ds:uri="http://schemas.microsoft.com/sharepoint/v3/contenttype/forms"/>
   </ds:schemaRefs>
 </ds:datastoreItem>
 </file>
 
 <file path=customXml/itemProps2.xml><?xml version="1.0" encoding="utf-8"?>
-<ds:datastoreItem xmlns:ds="http://schemas.openxmlformats.org/officeDocument/2006/customXml" ds:itemID="{524B6230-BF42-4C4C-9E11-338ABA133D3E}">
-  <ds:schemaRefs>
-    <ds:schemaRef ds:uri="http://schemas.microsoft.com/office/2006/metadata/properties"/>
-    <ds:schemaRef ds:uri="http://schemas.microsoft.com/office/infopath/2007/PartnerControls"/>
-    <ds:schemaRef ds:uri="27c1adeb-3674-457c-b08c-8a73f31b6e23"/>
-    <ds:schemaRef ds:uri="0a70e875-3d35-4be2-921f-7117c31bab9b"/>
-  </ds:schemaRefs>
-</ds:datastoreItem>
-</file>
-
-<file path=customXml/itemProps3.xml><?xml version="1.0" encoding="utf-8"?>
 <ds:datastoreItem xmlns:ds="http://schemas.openxmlformats.org/officeDocument/2006/customXml" ds:itemID="{FEC17C22-5049-4411-9B80-AF5480276204}">
   <ds:schemaRefs>
     <ds:schemaRef ds:uri="http://schemas.microsoft.com/office/2006/metadata/contentType"/>
@@ -8447,10 +8323,21 @@
 </ds:datastoreItem>
 </file>
 
+<file path=customXml/itemProps3.xml><?xml version="1.0" encoding="utf-8"?>
+<ds:datastoreItem xmlns:ds="http://schemas.openxmlformats.org/officeDocument/2006/customXml" ds:itemID="{524B6230-BF42-4C4C-9E11-338ABA133D3E}">
+  <ds:schemaRefs>
+    <ds:schemaRef ds:uri="http://schemas.microsoft.com/office/2006/metadata/properties"/>
+    <ds:schemaRef ds:uri="http://schemas.microsoft.com/office/infopath/2007/PartnerControls"/>
+    <ds:schemaRef ds:uri="27c1adeb-3674-457c-b08c-8a73f31b6e23"/>
+    <ds:schemaRef ds:uri="0a70e875-3d35-4be2-921f-7117c31bab9b"/>
+  </ds:schemaRefs>
+</ds:datastoreItem>
+</file>
+
 <file path=customXml/itemProps4.xml><?xml version="1.0" encoding="utf-8"?>
-<ds:datastoreItem xmlns:ds="http://schemas.openxmlformats.org/officeDocument/2006/customXml" ds:itemID="{8D9D84D8-2D2F-4DC4-A93D-919C34237140}">
+<ds:datastoreItem xmlns:ds="http://schemas.openxmlformats.org/officeDocument/2006/customXml" ds:itemID="{ED64A034-5F71-460F-B8D2-7705D0E3A65B}">
   <ds:schemaRefs>
-    <ds:schemaRef ds:uri="http://schemas.microsoft.com/sharepoint/v3/contenttype/forms"/>
+    <ds:schemaRef ds:uri="http://schemas.openxmlformats.org/officeDocument/2006/bibliography"/>
   </ds:schemaRefs>
 </ds:datastoreItem>
 </file>

</xml_diff>

<commit_message>
fix link for instruccions in inform
</commit_message>
<xml_diff>
--- a/docs/Informe_Actividad_1_GeneraciondeCodigo.docx
+++ b/docs/Informe_Actividad_1_GeneraciondeCodigo.docx
@@ -37,6 +37,9 @@
     <w:p>
       <w:pPr>
         <w:jc w:val="left"/>
+        <w:rPr>
+          <w:rStyle w:val="Hyperlink"/>
+        </w:rPr>
       </w:pPr>
       <w:r>
         <w:br/>
@@ -93,19 +96,58 @@
       <w:r>
         <w:t xml:space="preserve">: </w:t>
       </w:r>
-      <w:hyperlink r:id="rId13" w:history="1">
-        <w:r>
-          <w:rPr>
-            <w:rStyle w:val="Hyperlink"/>
-          </w:rPr>
-          <w:t>https://github.com/juank704/latamtradex-generativecode/tree/main#-credenciales-de-acceso-demo</w:t>
-        </w:r>
-      </w:hyperlink>
+      <w:r>
+        <w:fldChar w:fldCharType="begin"/>
+      </w:r>
+      <w:r>
+        <w:instrText>HYPERLINK "https://github.com/juank704/latamtradex-generativecode/tree/main" \l "-credenciales-de-acceso-demo"</w:instrText>
+      </w:r>
+      <w:r>
+        <w:fldChar w:fldCharType="separate"/>
+      </w:r>
+      <w:r>
+        <w:rPr>
+          <w:rStyle w:val="Hyperlink"/>
+        </w:rPr>
+        <w:t>https://git</w:t>
+      </w:r>
+      <w:r>
+        <w:rPr>
+          <w:rStyle w:val="Hyperlink"/>
+        </w:rPr>
+        <w:t>h</w:t>
+      </w:r>
+      <w:r>
+        <w:rPr>
+          <w:rStyle w:val="Hyperlink"/>
+        </w:rPr>
+        <w:t>ub.c</w:t>
+      </w:r>
+      <w:r>
+        <w:rPr>
+          <w:rStyle w:val="Hyperlink"/>
+        </w:rPr>
+        <w:t>o</w:t>
+      </w:r>
+      <w:r>
+        <w:rPr>
+          <w:rStyle w:val="Hyperlink"/>
+        </w:rPr>
+        <w:t>m/juank704/latamtradex-generativecode/tree/main#-credenciales-de-acceso-demo</w:t>
+      </w:r>
     </w:p>
     <w:p>
       <w:pPr>
         <w:pStyle w:val="TtuloApartado2"/>
       </w:pPr>
+      <w:r>
+        <w:rPr>
+          <w:color w:val="333333"/>
+          <w:sz w:val="24"/>
+          <w:szCs w:val="24"/>
+        </w:rPr>
+        <w:fldChar w:fldCharType="end"/>
+      </w:r>
       <w:r>
         <w:br/>
       </w:r>
@@ -401,7 +443,7 @@
                     </pic:cNvPicPr>
                   </pic:nvPicPr>
                   <pic:blipFill>
-                    <a:blip r:embed="rId14" cstate="print">
+                    <a:blip r:embed="rId13" cstate="print">
                       <a:extLst>
                         <a:ext uri="{28A0092B-C50C-407E-A947-70E740481C1C}">
                           <a14:useLocalDpi xmlns:a14="http://schemas.microsoft.com/office/drawing/2010/main" val="0"/>
@@ -469,7 +511,7 @@
                     </pic:cNvPicPr>
                   </pic:nvPicPr>
                   <pic:blipFill>
-                    <a:blip r:embed="rId15" cstate="print">
+                    <a:blip r:embed="rId14" cstate="print">
                       <a:extLst>
                         <a:ext uri="{28A0092B-C50C-407E-A947-70E740481C1C}">
                           <a14:useLocalDpi xmlns:a14="http://schemas.microsoft.com/office/drawing/2010/main" val="0"/>
@@ -543,7 +585,7 @@
                     <pic:cNvPicPr/>
                   </pic:nvPicPr>
                   <pic:blipFill>
-                    <a:blip r:embed="rId16"/>
+                    <a:blip r:embed="rId15"/>
                     <a:stretch>
                       <a:fillRect/>
                     </a:stretch>
@@ -608,7 +650,7 @@
                     <pic:cNvPicPr/>
                   </pic:nvPicPr>
                   <pic:blipFill>
-                    <a:blip r:embed="rId17"/>
+                    <a:blip r:embed="rId16"/>
                     <a:stretch>
                       <a:fillRect/>
                     </a:stretch>
@@ -665,7 +707,7 @@
                     <pic:cNvPicPr/>
                   </pic:nvPicPr>
                   <pic:blipFill>
-                    <a:blip r:embed="rId18"/>
+                    <a:blip r:embed="rId17"/>
                     <a:stretch>
                       <a:fillRect/>
                     </a:stretch>
@@ -728,7 +770,7 @@
                     <pic:cNvPicPr/>
                   </pic:nvPicPr>
                   <pic:blipFill>
-                    <a:blip r:embed="rId19"/>
+                    <a:blip r:embed="rId18"/>
                     <a:stretch>
                       <a:fillRect/>
                     </a:stretch>
@@ -782,7 +824,7 @@
                     </pic:cNvPicPr>
                   </pic:nvPicPr>
                   <pic:blipFill>
-                    <a:blip r:embed="rId20" cstate="print">
+                    <a:blip r:embed="rId19" cstate="print">
                       <a:extLst>
                         <a:ext uri="{28A0092B-C50C-407E-A947-70E740481C1C}">
                           <a14:useLocalDpi xmlns:a14="http://schemas.microsoft.com/office/drawing/2010/main" val="0"/>
@@ -876,7 +918,7 @@
       <w:r>
         <w:t xml:space="preserve">: </w:t>
       </w:r>
-      <w:hyperlink r:id="rId21" w:history="1">
+      <w:hyperlink r:id="rId20" w:history="1">
         <w:r>
           <w:rPr>
             <w:rStyle w:val="Hyperlink"/>
@@ -3109,8 +3151,8 @@
     </w:p>
     <w:p/>
     <w:sectPr>
-      <w:headerReference w:type="default" r:id="rId22"/>
-      <w:footerReference w:type="default" r:id="rId23"/>
+      <w:headerReference w:type="default" r:id="rId21"/>
+      <w:footerReference w:type="default" r:id="rId22"/>
       <w:pgSz w:w="11906" w:h="16838" w:code="9"/>
       <w:pgMar w:top="1418" w:right="1843" w:bottom="1418" w:left="1843" w:header="1134" w:footer="397" w:gutter="0"/>
       <w:cols w:space="708"/>
@@ -7732,6 +7774,18 @@
       <w:lang w:eastAsia="es-ES"/>
     </w:rPr>
   </w:style>
+  <w:style w:type="character" w:styleId="FollowedHyperlink">
+    <w:name w:val="FollowedHyperlink"/>
+    <w:basedOn w:val="DefaultParagraphFont"/>
+    <w:uiPriority w:val="99"/>
+    <w:semiHidden/>
+    <w:unhideWhenUsed/>
+    <w:rsid w:val="00F43CAD"/>
+    <w:rPr>
+      <w:color w:val="954F72" w:themeColor="followedHyperlink"/>
+      <w:u w:val="single"/>
+    </w:rPr>
+  </w:style>
 </w:styles>
 </file>
 
@@ -7997,15 +8051,30 @@
 </file>
 
 <file path=customXml/item1.xml><?xml version="1.0" encoding="utf-8"?>
-<?mso-contentType ?>
-<FormTemplates xmlns="http://schemas.microsoft.com/sharepoint/v3/contenttype/forms">
-  <Display>DocumentLibraryForm</Display>
-  <Edit>DocumentLibraryForm</Edit>
-  <New>DocumentLibraryForm</New>
-</FormTemplates>
+<b:Sources xmlns:b="http://schemas.openxmlformats.org/officeDocument/2006/bibliography" xmlns="http://schemas.openxmlformats.org/officeDocument/2006/bibliography" SelectedStyle="\APASixthEditionOfficeOnline.xsl" StyleName="APA" Version="6"/>
 </file>
 
 <file path=customXml/item2.xml><?xml version="1.0" encoding="utf-8"?>
+<p:properties xmlns:p="http://schemas.microsoft.com/office/2006/metadata/properties" xmlns:xsi="http://www.w3.org/2001/XMLSchema-instance" xmlns:pc="http://schemas.microsoft.com/office/infopath/2007/PartnerControls">
+  <documentManagement>
+    <lcf76f155ced4ddcb4097134ff3c332f xmlns="27c1adeb-3674-457c-b08c-8a73f31b6e23">
+      <Terms xmlns="http://schemas.microsoft.com/office/infopath/2007/PartnerControls"/>
+    </lcf76f155ced4ddcb4097134ff3c332f>
+    <TaxCatchAll xmlns="0a70e875-3d35-4be2-921f-7117c31bab9b" xsi:nil="true"/>
+    <MediaLengthInSeconds xmlns="27c1adeb-3674-457c-b08c-8a73f31b6e23" xsi:nil="true"/>
+    <SharedWithUsers xmlns="0a70e875-3d35-4be2-921f-7117c31bab9b">
+      <UserInfo>
+        <DisplayName/>
+        <AccountId xsi:nil="true"/>
+        <AccountType/>
+      </UserInfo>
+    </SharedWithUsers>
+    <_Flow_SignoffStatus xmlns="27c1adeb-3674-457c-b08c-8a73f31b6e23" xsi:nil="true"/>
+  </documentManagement>
+</p:properties>
+</file>
+
+<file path=customXml/item3.xml><?xml version="1.0" encoding="utf-8"?>
 <ct:contentTypeSchema xmlns:ct="http://schemas.microsoft.com/office/2006/metadata/contentType" xmlns:ma="http://schemas.microsoft.com/office/2006/metadata/properties/metaAttributes" ct:_="" ma:_="" ma:contentTypeName="Documento" ma:contentTypeID="0x010100DF3D7C797EA12745A270EF30E38719B9" ma:contentTypeVersion="20" ma:contentTypeDescription="Crear nuevo documento." ma:contentTypeScope="" ma:versionID="98b23ce13f8ef13134c980882a27b8cc">
   <xsd:schema xmlns:xsd="http://www.w3.org/2001/XMLSchema" xmlns:xs="http://www.w3.org/2001/XMLSchema" xmlns:p="http://schemas.microsoft.com/office/2006/metadata/properties" xmlns:ns2="0a70e875-3d35-4be2-921f-7117c31bab9b" xmlns:ns3="27c1adeb-3674-457c-b08c-8a73f31b6e23" targetNamespace="http://schemas.microsoft.com/office/2006/metadata/properties" ma:root="true" ma:fieldsID="83d50475b18a8f95f7f8edf1c6caa3f2" ns2:_="" ns3:_="">
     <xsd:import namespace="0a70e875-3d35-4be2-921f-7117c31bab9b"/>
@@ -8272,39 +8341,35 @@
 </ct:contentTypeSchema>
 </file>
 
-<file path=customXml/item3.xml><?xml version="1.0" encoding="utf-8"?>
-<p:properties xmlns:p="http://schemas.microsoft.com/office/2006/metadata/properties" xmlns:xsi="http://www.w3.org/2001/XMLSchema-instance" xmlns:pc="http://schemas.microsoft.com/office/infopath/2007/PartnerControls">
-  <documentManagement>
-    <lcf76f155ced4ddcb4097134ff3c332f xmlns="27c1adeb-3674-457c-b08c-8a73f31b6e23">
-      <Terms xmlns="http://schemas.microsoft.com/office/infopath/2007/PartnerControls"/>
-    </lcf76f155ced4ddcb4097134ff3c332f>
-    <TaxCatchAll xmlns="0a70e875-3d35-4be2-921f-7117c31bab9b" xsi:nil="true"/>
-    <MediaLengthInSeconds xmlns="27c1adeb-3674-457c-b08c-8a73f31b6e23" xsi:nil="true"/>
-    <SharedWithUsers xmlns="0a70e875-3d35-4be2-921f-7117c31bab9b">
-      <UserInfo>
-        <DisplayName/>
-        <AccountId xsi:nil="true"/>
-        <AccountType/>
-      </UserInfo>
-    </SharedWithUsers>
-    <_Flow_SignoffStatus xmlns="27c1adeb-3674-457c-b08c-8a73f31b6e23" xsi:nil="true"/>
-  </documentManagement>
-</p:properties>
-</file>
-
 <file path=customXml/item4.xml><?xml version="1.0" encoding="utf-8"?>
-<b:Sources xmlns:b="http://schemas.openxmlformats.org/officeDocument/2006/bibliography" xmlns="http://schemas.openxmlformats.org/officeDocument/2006/bibliography" SelectedStyle="\APASixthEditionOfficeOnline.xsl" StyleName="APA" Version="6"/>
+<?mso-contentType ?>
+<FormTemplates xmlns="http://schemas.microsoft.com/sharepoint/v3/contenttype/forms">
+  <Display>DocumentLibraryForm</Display>
+  <Edit>DocumentLibraryForm</Edit>
+  <New>DocumentLibraryForm</New>
+</FormTemplates>
 </file>
 
 <file path=customXml/itemProps1.xml><?xml version="1.0" encoding="utf-8"?>
-<ds:datastoreItem xmlns:ds="http://schemas.openxmlformats.org/officeDocument/2006/customXml" ds:itemID="{8D9D84D8-2D2F-4DC4-A93D-919C34237140}">
+<ds:datastoreItem xmlns:ds="http://schemas.openxmlformats.org/officeDocument/2006/customXml" ds:itemID="{ED64A034-5F71-460F-B8D2-7705D0E3A65B}">
   <ds:schemaRefs>
-    <ds:schemaRef ds:uri="http://schemas.microsoft.com/sharepoint/v3/contenttype/forms"/>
+    <ds:schemaRef ds:uri="http://schemas.openxmlformats.org/officeDocument/2006/bibliography"/>
   </ds:schemaRefs>
 </ds:datastoreItem>
 </file>
 
 <file path=customXml/itemProps2.xml><?xml version="1.0" encoding="utf-8"?>
+<ds:datastoreItem xmlns:ds="http://schemas.openxmlformats.org/officeDocument/2006/customXml" ds:itemID="{524B6230-BF42-4C4C-9E11-338ABA133D3E}">
+  <ds:schemaRefs>
+    <ds:schemaRef ds:uri="http://schemas.microsoft.com/office/2006/metadata/properties"/>
+    <ds:schemaRef ds:uri="http://schemas.microsoft.com/office/infopath/2007/PartnerControls"/>
+    <ds:schemaRef ds:uri="27c1adeb-3674-457c-b08c-8a73f31b6e23"/>
+    <ds:schemaRef ds:uri="0a70e875-3d35-4be2-921f-7117c31bab9b"/>
+  </ds:schemaRefs>
+</ds:datastoreItem>
+</file>
+
+<file path=customXml/itemProps3.xml><?xml version="1.0" encoding="utf-8"?>
 <ds:datastoreItem xmlns:ds="http://schemas.openxmlformats.org/officeDocument/2006/customXml" ds:itemID="{FEC17C22-5049-4411-9B80-AF5480276204}">
   <ds:schemaRefs>
     <ds:schemaRef ds:uri="http://schemas.microsoft.com/office/2006/metadata/contentType"/>
@@ -8323,21 +8388,10 @@
 </ds:datastoreItem>
 </file>
 
-<file path=customXml/itemProps3.xml><?xml version="1.0" encoding="utf-8"?>
-<ds:datastoreItem xmlns:ds="http://schemas.openxmlformats.org/officeDocument/2006/customXml" ds:itemID="{524B6230-BF42-4C4C-9E11-338ABA133D3E}">
+<file path=customXml/itemProps4.xml><?xml version="1.0" encoding="utf-8"?>
+<ds:datastoreItem xmlns:ds="http://schemas.openxmlformats.org/officeDocument/2006/customXml" ds:itemID="{8D9D84D8-2D2F-4DC4-A93D-919C34237140}">
   <ds:schemaRefs>
-    <ds:schemaRef ds:uri="http://schemas.microsoft.com/office/2006/metadata/properties"/>
-    <ds:schemaRef ds:uri="http://schemas.microsoft.com/office/infopath/2007/PartnerControls"/>
-    <ds:schemaRef ds:uri="27c1adeb-3674-457c-b08c-8a73f31b6e23"/>
-    <ds:schemaRef ds:uri="0a70e875-3d35-4be2-921f-7117c31bab9b"/>
-  </ds:schemaRefs>
-</ds:datastoreItem>
-</file>
-
-<file path=customXml/itemProps4.xml><?xml version="1.0" encoding="utf-8"?>
-<ds:datastoreItem xmlns:ds="http://schemas.openxmlformats.org/officeDocument/2006/customXml" ds:itemID="{ED64A034-5F71-460F-B8D2-7705D0E3A65B}">
-  <ds:schemaRefs>
-    <ds:schemaRef ds:uri="http://schemas.openxmlformats.org/officeDocument/2006/bibliography"/>
+    <ds:schemaRef ds:uri="http://schemas.microsoft.com/sharepoint/v3/contenttype/forms"/>
   </ds:schemaRefs>
 </ds:datastoreItem>
 </file>

</xml_diff>